<commit_message>
checkpoint: record world creation and step 10 handoff
</commit_message>
<xml_diff>
--- a/worlds/korvin-merrow/file-review/revision/filesystem/family_communication_care_conference_05222026.docx
+++ b/worlds/korvin-merrow/file-review/revision/filesystem/family_communication_care_conference_05222026.docx
@@ -1292,8 +1292,8 @@
       <w:r>
         <w:rPr>
           <w:rFonts w:ascii="Arial" w:hAnsi="Arial"/>
-          <w:b/>
-          <w:i/>
+          <w:b w:val="0"/>
+          <w:i w:val="0"/>
           <w:sz w:val="19"/>
         </w:rPr>
         <w:t>“Better than Monday is not the same as ready to manage the next steps without support.”</w:t>

</xml_diff>